<commit_message>
Upgrade Android toolchain and field capture workflow
</commit_message>
<xml_diff>
--- a/documentation.docx
+++ b/documentation.docx
@@ -7,27 +7,27 @@
         <w:pStyle w:val="Heading1"/>
       </w:pPr>
       <w:r>
-        <w:t>Lucid Era Fieldbook Documentation</w:t>
+        <w:t>Lucid Era Field Notes Documentation</w:t>
       </w:r>
     </w:p>
     <w:p>
       <w:r>
-        <w:t>Lucid Era Fieldbook is a mobile companion for my OSINT investigation workflow. Instead of building a generic school demo, I designed the app around the real process described in my Lucid Era Investigations framework: intake and scoping, lead collection, entity mapping, verification, and evidence preservation. The app gives me one place to create a case, define the essential question, track the primary subject, record publication thresholds, log raw leads, and capture entity notes that can later be promoted into verified findings. This makes the app useful for local accountability reporting and research rather than just satisfying a checklist.</w:t>
+        <w:t>Lucid Era Field Notes is built around the way I actually work cases in Lucid Era Investigations. I did not want a generic class app, so I structured it around case intake, lead logging, entity tracking, archive checking, and evidence capture. Each case stores the essential question, subject, classification, publication threshold, folder name, and master note name so it lines up with my Obsidian investigation vault. On the phone, I can log leads, add entity records, capture photos, and dictate notes in the field without losing the structure I use on desktop.</w:t>
       </w:r>
     </w:p>
     <w:p>
       <w:r>
-        <w:t>The application uses a multi-screen Jetpack Compose interface with Navigation Compose. The dashboard screen summarizes active work and reinforces the investigation workflow. The cases screen supports case intake and lists all active investigations. The case detail screen acts as the working file for a selected investigation, where I can add leads, record archive links, and create entity records. A separate archive lookup screen integrates a public web API from the Wayback Machine so I can check whether a source has already been archived before I analyze it. This aligns with my standard of preserving evidence first and reviewing it second.</w:t>
+        <w:t>The app uses a multi-screen Jetpack Compose interface with Navigation Compose. The dashboard gives a quick read on active cases, leads, and tracked entities. The cases screen handles intake and case selection. The case detail screen is the main working surface for a single investigation, where I can add leads, link entities, attach photos from the camera or gallery, and export case material as Markdown. The archive screen connects to the Wayback Machine API so I can check whether a public page has already been preserved before I rely on it. That matches my normal rule: preserve the page first, then work from the preserved record.</w:t>
       </w:r>
     </w:p>
     <w:p>
       <w:r>
-        <w:t>For architecture, I separated UI, state, data, and networking layers. Composables focus on presentation and user interaction. ViewModels manage screen state and launch coroutines for database and network operations, which keeps business logic out of the UI layer. Room is used as the persistence layer because this project needs structured CRUD operations across related data types: cases, leads, and entity profiles. The repository coordinates Room and the archive API so the rest of the app has a clean interface for local and remote data.</w:t>
+        <w:t>Architecturally, I separated UI, state, persistence, and network logic. Composables handle presentation and user interaction. ViewModels hold screen state and launch coroutines for database and API work so the composables stay focused on rendering. Room is the local persistence layer because the project needs real CRUD support across related records such as cases, leads, entities, and attachments. A repository sits between the UI and the data sources so the rest of the app can work with one consistent interface for local records and archive lookups.</w:t>
       </w:r>
     </w:p>
     <w:p>
       <w:r>
-        <w:t>ViewModel plays a key role in preventing data loss during configuration changes. If the device rotates or the activity is recreated, screen state is restored from the ViewModel rather than being lost inside individual composables. This is especially important for case detail data, archive lookups, and the overall workflow because investigation work often happens in longer sessions. One challenge was keeping the project small enough to finish while still making it feel authentic to my investigative practice. I solved that by focusing on a narrow but credible feature set: workflow-centered case management plus archive verification through a real public API.</w:t>
+        <w:t>ViewModel is important here because this app is meant to be used during longer research sessions, not just tapped through once. If the phone rotates or Android recreates the activity, the current case view and archive state are restored instead of being lost from the screen. The biggest challenge was keeping the project small enough for the course while still making it useful after the class ends. I solved that by focusing on a tight set of features that matter in my workflow: case management, structured notes, archive checks, Markdown export into Obsidian, dictation, and photo capture. That kept the scope realistic while still making the app something I can actually use.</w:t>
       </w:r>
     </w:p>
     <w:sectPr>

</xml_diff>